<commit_message>
docs: sanitize firm identifiers and align efficiency metrics
</commit_message>
<xml_diff>
--- a/模板文件/template_审核报告.docx
+++ b/模板文件/template_审核报告.docx
@@ -6520,7 +6520,7 @@
                 <w:kern w:val="0"/>
                 <w:sz w:val="24"/>
               </w:rPr>
-              <w:t>胡晓辉</w:t>
+              <w:t>人员甲</w:t>
             </w:r>
           </w:p>
         </w:tc>
@@ -6716,7 +6716,7 @@
                 <w:kern w:val="0"/>
                 <w:sz w:val="24"/>
               </w:rPr>
-              <w:t>钱国楠</w:t>
+              <w:t>人员乙</w:t>
             </w:r>
           </w:p>
         </w:tc>

</xml_diff>